<commit_message>
Sync hospitality workflow updates
</commit_message>
<xml_diff>
--- a/applications/hospitality-lanes/Matt Dimock - Barback Bar Support.docx
+++ b/applications/hospitality-lanes/Matt Dimock - Barback Bar Support.docx
@@ -70,7 +70,7 @@
           <w:color w:val="1C1F24"/>
           <w:sz w:val="18"/>
         </w:rPr>
-        <w:t>Reliable, physically capable operations professional with recent experience managing fast-moving work, tight handoffs, and high expectations, plus earlier retail team-lead experience in stocking, customer service, opening and closing, and department upkeep. Familiar with common spirits and classic cocktail structure from years of home practice, and ready to earn trust quickly in a high-volume bar environment.</w:t>
+        <w:t>Reliable, physically capable operations professional with recent experience managing fast-moving work, tight handoffs, and high expectations, plus earlier retail team-lead experience in stocking, customer service, opening and closing, and department upkeep. Ready to earn trust quickly in a high-volume support environment.</w:t>
       </w:r>
     </w:p>
     <w:p>
@@ -126,7 +126,7 @@
           <w:color w:val="1C1F24"/>
           <w:sz w:val="18"/>
         </w:rPr>
-        <w:t>• Strong stocking, reset, cleanliness, and side-work discipline</w:t>
+        <w:t>• Strong stocking, restocking, organization, and follow-through</w:t>
       </w:r>
     </w:p>
     <w:p>
@@ -154,7 +154,7 @@
           <w:color w:val="1C1F24"/>
           <w:sz w:val="18"/>
         </w:rPr>
-        <w:t>• Fast learner with strong memory for house standards and drink builds</w:t>
+        <w:t>• Fast learner with strong memory for standards and routines</w:t>
       </w:r>
     </w:p>
     <w:p>
@@ -419,20 +419,6 @@
           <w:sz w:val="18"/>
         </w:rPr>
         <w:t>• Local to Mount Juliet and open to downtown Nashville work</w:t>
-      </w:r>
-    </w:p>
-    <w:p>
-      <w:pPr>
-        <w:spacing w:before="0" w:after="20"/>
-        <w:ind w:left="200" w:hanging="160"/>
-      </w:pPr>
-      <w:r>
-        <w:rPr>
-          <w:rFonts w:ascii="Aptos" w:hAnsi="Aptos"/>
-          <w:color w:val="1C1F24"/>
-          <w:sz w:val="18"/>
-        </w:rPr>
-        <w:t>• Familiar with common spirits, mixers, garnishes, and classic cocktail structure</w:t>
       </w:r>
     </w:p>
     <w:p>

</xml_diff>